<commit_message>
Guide 1.6: pull the figures back onto full pages
The 1.6 text additions had pushed each figure onto the next page,
leaving three pages 71-79% full and a 23% last page. Figures 1 and 2
now sit after their sections' opening sentences instead of at the
section ends, where they fit: 6 pages, every page 91-96% full except
the normal partial last page. Content unchanged; PAGINATION CLEAN.

Co-Authored-By: Claude Fable 5 <noreply@anthropic.com>
</commit_message>
<xml_diff>
--- a/Documents/User Guide (Ver 1.6).docx
+++ b/Documents/User Guide (Ver 1.6).docx
@@ -986,191 +986,6 @@
       </w:r>
       <w:r>
         <w:t xml:space="preserve"> the frame is what gets built.</w:t>
-      </w:r>
-    </w:p>
-    <w:p>
-      <w:pPr>
-        <w:pStyle w:val="ListParagraph"/>
-        <w:numPr>
-          <w:ilvl w:val="0"/>
-          <w:numId w:val="101"/>
-        </w:numPr>
-        <w:spacing w:before="0" w:after="60"/>
-        <w:contextualSpacing w:val="0"/>
-        <w:rPr>
-          <w:rFonts w:eastAsia="Times New Roman"/>
-        </w:rPr>
-      </w:pPr>
-      <w:r>
-        <w:rPr>
-          <w:i/>
-          <w:iCs/>
-        </w:rPr>
-        <w:t xml:space="preserve">Move it</w:t>
-      </w:r>
-      <w:r>
-        <w:t xml:space="preserve"> — drag the frame's border. </w:t>
-      </w:r>
-      <w:r>
-        <w:rPr>
-          <w:i/>
-          <w:iCs/>
-        </w:rPr>
-        <w:t xml:space="preserve">Resize it</w:t>
-      </w:r>
-      <w:r>
-        <w:t xml:space="preserve"> — drag a corner (the cells stay square).</w:t>
-      </w:r>
-    </w:p>
-    <w:p>
-      <w:pPr>
-        <w:pStyle w:val="ListParagraph"/>
-        <w:numPr>
-          <w:ilvl w:val="0"/>
-          <w:numId w:val="101"/>
-        </w:numPr>
-        <w:spacing w:before="0" w:after="60"/>
-        <w:contextualSpacing w:val="0"/>
-        <w:rPr>
-          <w:rFonts w:eastAsia="Times New Roman"/>
-        </w:rPr>
-      </w:pPr>
-      <w:r>
-        <w:rPr>
-          <w:i/>
-          <w:iCs/>
-        </w:rPr>
-        <w:t xml:space="preserve">Fit to Photo</w:t>
-      </w:r>
-      <w:r>
-        <w:t xml:space="preserve"> — one press lays the grid over the photo for you: the largest area of the grid’s shape that fits the picture. Adjust from there if you want a different framing.</w:t>
-      </w:r>
-    </w:p>
-    <w:p>
-      <w:pPr>
-        <w:pStyle w:val="ListParagraph"/>
-        <w:numPr>
-          <w:ilvl w:val="0"/>
-          <w:numId w:val="101"/>
-        </w:numPr>
-        <w:spacing w:before="0" w:after="60"/>
-        <w:contextualSpacing w:val="0"/>
-        <w:rPr>
-          <w:rFonts w:eastAsia="Times New Roman"/>
-        </w:rPr>
-      </w:pPr>
-      <w:r>
-        <w:rPr>
-          <w:i/>
-          <w:iCs/>
-        </w:rPr>
-        <w:t xml:space="preserve">Across and Down</w:t>
-      </w:r>
-      <w:r>
-        <w:t xml:space="preserve"> — in the </w:t>
-      </w:r>
-      <w:r>
-        <w:rPr>
-          <w:i/>
-          <w:iCs/>
-        </w:rPr>
-        <w:t xml:space="preserve">Grid Controls</w:t>
-      </w:r>
-      <w:r>
-        <w:t xml:space="preserve"> section of Setup (press </w:t>
-      </w:r>
-      <w:r>
-        <w:rPr>
-          <w:i/>
-          <w:iCs/>
-        </w:rPr>
-        <w:t xml:space="preserve">Settings</w:t>
-      </w:r>
-      <w:r>
-        <w:t xml:space="preserve">), set how many tiles wide and tall. The standard baseplate is </w:t>
-      </w:r>
-      <w:r>
-        <w:rPr>
-          <w:rStyle w:val="Strong"/>
-          <w:rFonts w:eastAsia="Times New Roman"/>
-        </w:rPr>
-        <w:t xml:space="preserve">32 × 32</w:t>
-      </w:r>
-      <w:r>
-        <w:t xml:space="preserve">, and that is the default. The readout shows the real size — 32 × 32 tiles is about </w:t>
-      </w:r>
-      <w:r>
-        <w:rPr>
-          <w:rStyle w:val="Strong"/>
-          <w:rFonts w:eastAsia="Times New Roman"/>
-        </w:rPr>
-        <w:t xml:space="preserve">256 mm ≈ 10 inches</w:t>
-      </w:r>
-      <w:r>
-        <w:t xml:space="preserve"> — so you know how big the finished piece will be.</w:t>
-      </w:r>
-    </w:p>
-    <w:p>
-      <w:pPr>
-        <w:pStyle w:val="ListParagraph"/>
-        <w:numPr>
-          <w:ilvl w:val="0"/>
-          <w:numId w:val="101"/>
-        </w:numPr>
-        <w:spacing w:before="0" w:after="60"/>
-        <w:contextualSpacing w:val="0"/>
-        <w:rPr>
-          <w:rFonts w:eastAsia="Times New Roman"/>
-        </w:rPr>
-      </w:pPr>
-      <w:r>
-        <w:rPr>
-          <w:i/>
-          <w:iCs/>
-        </w:rPr>
-        <w:t xml:space="preserve">Show</w:t>
-      </w:r>
-      <w:r>
-        <w:t xml:space="preserve"> — three checkboxes for what you see on the workspace: </w:t>
-      </w:r>
-      <w:r>
-        <w:rPr>
-          <w:rStyle w:val="Strong"/>
-          <w:rFonts w:eastAsia="Times New Roman"/>
-        </w:rPr>
-        <w:t xml:space="preserve">Grid</w:t>
-      </w:r>
-      <w:r>
-        <w:t xml:space="preserve"> (the cell lines and the row and column labels — numbers across the top, letters down the side — that you follow while building), </w:t>
-      </w:r>
-      <w:r>
-        <w:rPr>
-          <w:rStyle w:val="Strong"/>
-          <w:rFonts w:eastAsia="Times New Roman"/>
-        </w:rPr>
-        <w:t xml:space="preserve">Baseplate</w:t>
-      </w:r>
-      <w:r>
-        <w:t xml:space="preserve"> (the studded plate behind the tiles), and </w:t>
-      </w:r>
-      <w:r>
-        <w:rPr>
-          <w:rStyle w:val="Strong"/>
-          <w:rFonts w:eastAsia="Times New Roman"/>
-        </w:rPr>
-        <w:t xml:space="preserve">Box</w:t>
-      </w:r>
-      <w:r>
-        <w:t xml:space="preserve"> (the outline around the mosaic). Turn any of them off — turn all three off to see just the mosaic itself.</w:t>
-      </w:r>
-    </w:p>
-    <w:p>
-      <w:pPr>
-        <w:pStyle w:val="NormalWeb"/>
-        <w:spacing w:before="100" w:beforeAutospacing="0" w:after="100" w:afterAutospacing="0"/>
-      </w:pPr>
-      <w:r>
-        <w:t xml:space="preserve">Fewer tiles across make bigger, blockier tiles and a coarser picture; more make a finer picture that needs more, smaller tiles. Slide the frame over the part of your animal you most want to capture.</w:t>
       </w:r>
     </w:p>
     <w:p>
@@ -1232,6 +1047,191 @@
     </w:p>
     <w:p>
       <w:pPr>
+        <w:pStyle w:val="ListParagraph"/>
+        <w:numPr>
+          <w:ilvl w:val="0"/>
+          <w:numId w:val="101"/>
+        </w:numPr>
+        <w:spacing w:before="0" w:after="60"/>
+        <w:contextualSpacing w:val="0"/>
+        <w:rPr>
+          <w:rFonts w:eastAsia="Times New Roman"/>
+        </w:rPr>
+      </w:pPr>
+      <w:r>
+        <w:rPr>
+          <w:i/>
+          <w:iCs/>
+        </w:rPr>
+        <w:t xml:space="preserve">Move it</w:t>
+      </w:r>
+      <w:r>
+        <w:t xml:space="preserve"> — drag the frame's border. </w:t>
+      </w:r>
+      <w:r>
+        <w:rPr>
+          <w:i/>
+          <w:iCs/>
+        </w:rPr>
+        <w:t xml:space="preserve">Resize it</w:t>
+      </w:r>
+      <w:r>
+        <w:t xml:space="preserve"> — drag a corner (the cells stay square).</w:t>
+      </w:r>
+    </w:p>
+    <w:p>
+      <w:pPr>
+        <w:pStyle w:val="ListParagraph"/>
+        <w:numPr>
+          <w:ilvl w:val="0"/>
+          <w:numId w:val="101"/>
+        </w:numPr>
+        <w:spacing w:before="0" w:after="60"/>
+        <w:contextualSpacing w:val="0"/>
+        <w:rPr>
+          <w:rFonts w:eastAsia="Times New Roman"/>
+        </w:rPr>
+      </w:pPr>
+      <w:r>
+        <w:rPr>
+          <w:i/>
+          <w:iCs/>
+        </w:rPr>
+        <w:t xml:space="preserve">Fit to Photo</w:t>
+      </w:r>
+      <w:r>
+        <w:t xml:space="preserve"> — one press lays the grid over the photo for you: the largest area of the grid’s shape that fits the picture. Adjust from there if you want a different framing.</w:t>
+      </w:r>
+    </w:p>
+    <w:p>
+      <w:pPr>
+        <w:pStyle w:val="ListParagraph"/>
+        <w:numPr>
+          <w:ilvl w:val="0"/>
+          <w:numId w:val="101"/>
+        </w:numPr>
+        <w:spacing w:before="0" w:after="60"/>
+        <w:contextualSpacing w:val="0"/>
+        <w:rPr>
+          <w:rFonts w:eastAsia="Times New Roman"/>
+        </w:rPr>
+      </w:pPr>
+      <w:r>
+        <w:rPr>
+          <w:i/>
+          <w:iCs/>
+        </w:rPr>
+        <w:t xml:space="preserve">Across and Down</w:t>
+      </w:r>
+      <w:r>
+        <w:t xml:space="preserve"> — in the </w:t>
+      </w:r>
+      <w:r>
+        <w:rPr>
+          <w:i/>
+          <w:iCs/>
+        </w:rPr>
+        <w:t xml:space="preserve">Grid Controls</w:t>
+      </w:r>
+      <w:r>
+        <w:t xml:space="preserve"> section of Setup (press </w:t>
+      </w:r>
+      <w:r>
+        <w:rPr>
+          <w:i/>
+          <w:iCs/>
+        </w:rPr>
+        <w:t xml:space="preserve">Settings</w:t>
+      </w:r>
+      <w:r>
+        <w:t xml:space="preserve">), set how many tiles wide and tall. The standard baseplate is </w:t>
+      </w:r>
+      <w:r>
+        <w:rPr>
+          <w:rStyle w:val="Strong"/>
+          <w:rFonts w:eastAsia="Times New Roman"/>
+        </w:rPr>
+        <w:t xml:space="preserve">32 × 32</w:t>
+      </w:r>
+      <w:r>
+        <w:t xml:space="preserve">, and that is the default. The readout shows the real size — 32 × 32 tiles is about </w:t>
+      </w:r>
+      <w:r>
+        <w:rPr>
+          <w:rStyle w:val="Strong"/>
+          <w:rFonts w:eastAsia="Times New Roman"/>
+        </w:rPr>
+        <w:t xml:space="preserve">256 mm ≈ 10 inches</w:t>
+      </w:r>
+      <w:r>
+        <w:t xml:space="preserve"> — so you know how big the finished piece will be.</w:t>
+      </w:r>
+    </w:p>
+    <w:p>
+      <w:pPr>
+        <w:pStyle w:val="ListParagraph"/>
+        <w:numPr>
+          <w:ilvl w:val="0"/>
+          <w:numId w:val="101"/>
+        </w:numPr>
+        <w:spacing w:before="0" w:after="60"/>
+        <w:contextualSpacing w:val="0"/>
+        <w:rPr>
+          <w:rFonts w:eastAsia="Times New Roman"/>
+        </w:rPr>
+      </w:pPr>
+      <w:r>
+        <w:rPr>
+          <w:i/>
+          <w:iCs/>
+        </w:rPr>
+        <w:t xml:space="preserve">Show</w:t>
+      </w:r>
+      <w:r>
+        <w:t xml:space="preserve"> — three checkboxes for what you see on the workspace: </w:t>
+      </w:r>
+      <w:r>
+        <w:rPr>
+          <w:rStyle w:val="Strong"/>
+          <w:rFonts w:eastAsia="Times New Roman"/>
+        </w:rPr>
+        <w:t xml:space="preserve">Grid</w:t>
+      </w:r>
+      <w:r>
+        <w:t xml:space="preserve"> (the cell lines and the row and column labels — numbers across the top, letters down the side — that you follow while building), </w:t>
+      </w:r>
+      <w:r>
+        <w:rPr>
+          <w:rStyle w:val="Strong"/>
+          <w:rFonts w:eastAsia="Times New Roman"/>
+        </w:rPr>
+        <w:t xml:space="preserve">Baseplate</w:t>
+      </w:r>
+      <w:r>
+        <w:t xml:space="preserve"> (the studded plate behind the tiles), and </w:t>
+      </w:r>
+      <w:r>
+        <w:rPr>
+          <w:rStyle w:val="Strong"/>
+          <w:rFonts w:eastAsia="Times New Roman"/>
+        </w:rPr>
+        <w:t xml:space="preserve">Box</w:t>
+      </w:r>
+      <w:r>
+        <w:t xml:space="preserve"> (the outline around the mosaic). Turn any of them off — turn all three off to see just the mosaic itself.</w:t>
+      </w:r>
+    </w:p>
+    <w:p>
+      <w:pPr>
+        <w:pStyle w:val="NormalWeb"/>
+        <w:spacing w:before="100" w:beforeAutospacing="0" w:after="100" w:afterAutospacing="0"/>
+      </w:pPr>
+      <w:r>
+        <w:t xml:space="preserve">Fewer tiles across make bigger, blockier tiles and a coarser picture; more make a finer picture that needs more, smaller tiles. Slide the frame over the part of your animal you most want to capture.</w:t>
+      </w:r>
+    </w:p>
+    <w:p>
+      <w:pPr>
         <w:pStyle w:val="Heading2"/>
         <w:keepNext/>
         <w:keepLines/>
@@ -1273,130 +1273,6 @@
       </w:r>
       <w:r>
         <w:t xml:space="preserve"> lets you check it against the photo.</w:t>
-      </w:r>
-    </w:p>
-    <w:p>
-      <w:pPr>
-        <w:pStyle w:val="NormalWeb"/>
-        <w:spacing w:before="0" w:beforeAutospacing="0" w:after="60" w:afterAutospacing="0"/>
-      </w:pPr>
-      <w:r>
-        <w:t xml:space="preserve">A few controls (in the </w:t>
-      </w:r>
-      <w:r>
-        <w:rPr>
-          <w:i/>
-          <w:iCs/>
-        </w:rPr>
-        <w:t xml:space="preserve">Adjust Mosaic</w:t>
-      </w:r>
-      <w:r>
-        <w:t xml:space="preserve"> part of the panel) shape the result; change any one and the mosaic re-maps at once:</w:t>
-      </w:r>
-    </w:p>
-    <w:p>
-      <w:pPr>
-        <w:pStyle w:val="ListParagraph"/>
-        <w:numPr>
-          <w:ilvl w:val="0"/>
-          <w:numId w:val="100"/>
-        </w:numPr>
-        <w:spacing w:before="0" w:after="60"/>
-        <w:contextualSpacing w:val="0"/>
-        <w:rPr>
-          <w:rFonts w:eastAsia="Times New Roman"/>
-        </w:rPr>
-      </w:pPr>
-      <w:r>
-        <w:rPr>
-          <w:rStyle w:val="Strong"/>
-          <w:rFonts w:eastAsia="Times New Roman"/>
-        </w:rPr>
-        <w:t xml:space="preserve">Ignore background</w:t>
-      </w:r>
-      <w:r>
-        <w:t xml:space="preserve"> (on by default) — treats the removed or empty background as empty cells, so thin parts like legs survive instead of being outvoted by a sea of sky.</w:t>
-      </w:r>
-    </w:p>
-    <w:p>
-      <w:pPr>
-        <w:pStyle w:val="ListParagraph"/>
-        <w:numPr>
-          <w:ilvl w:val="0"/>
-          <w:numId w:val="100"/>
-        </w:numPr>
-        <w:spacing w:before="0" w:after="60"/>
-        <w:contextualSpacing w:val="0"/>
-        <w:rPr>
-          <w:rFonts w:eastAsia="Times New Roman"/>
-        </w:rPr>
-      </w:pPr>
-      <w:r>
-        <w:rPr>
-          <w:rStyle w:val="Strong"/>
-          <w:rFonts w:eastAsia="Times New Roman"/>
-        </w:rPr>
-        <w:t xml:space="preserve">Colors</w:t>
-      </w:r>
-      <w:r>
-        <w:t xml:space="preserve"> — how many different tile colors to reduce the picture to. A low number gives a bolder, simpler mosaic; a high number gives more shading. Sangala always snaps these to your nearest owned colors.</w:t>
-      </w:r>
-    </w:p>
-    <w:p>
-      <w:pPr>
-        <w:pStyle w:val="ListParagraph"/>
-        <w:numPr>
-          <w:ilvl w:val="0"/>
-          <w:numId w:val="100"/>
-        </w:numPr>
-        <w:spacing w:before="0" w:after="60"/>
-        <w:contextualSpacing w:val="0"/>
-        <w:rPr>
-          <w:rFonts w:eastAsia="Times New Roman"/>
-        </w:rPr>
-      </w:pPr>
-      <w:r>
-        <w:rPr>
-          <w:rStyle w:val="Strong"/>
-          <w:rFonts w:eastAsia="Times New Roman"/>
-        </w:rPr>
-        <w:t xml:space="preserve">Clean up</w:t>
-      </w:r>
-      <w:r>
-        <w:t xml:space="preserve"> — gently fills single-tile holes and drops lone stray tiles, so the mosaic reads cleanly without erasing real detail.</w:t>
-      </w:r>
-    </w:p>
-    <w:p>
-      <w:pPr>
-        <w:pStyle w:val="ListParagraph"/>
-        <w:numPr>
-          <w:ilvl w:val="0"/>
-          <w:numId w:val="100"/>
-        </w:numPr>
-        <w:spacing w:before="0" w:after="60"/>
-        <w:contextualSpacing w:val="0"/>
-        <w:rPr>
-          <w:rFonts w:eastAsia="Times New Roman"/>
-        </w:rPr>
-      </w:pPr>
-      <w:r>
-        <w:rPr>
-          <w:rStyle w:val="Strong"/>
-          <w:rFonts w:eastAsia="Times New Roman"/>
-        </w:rPr>
-        <w:t xml:space="preserve">Contrast and Brightness</w:t>
-      </w:r>
-      <w:r>
-        <w:t xml:space="preserve"> — adjust these if the picture is going muddy; a little more contrast separates the colors before they are reduced.</w:t>
-      </w:r>
-    </w:p>
-    <w:p>
-      <w:pPr>
-        <w:pStyle w:val="NormalWeb"/>
-        <w:spacing w:before="100" w:beforeAutospacing="0" w:after="100" w:afterAutospacing="0"/>
-      </w:pPr>
-      <w:r>
-        <w:t xml:space="preserve">If the result is close but not perfect, that is expected — the last touch-ups are done by hand (Section 10).</w:t>
       </w:r>
     </w:p>
     <w:p>
@@ -1454,6 +1330,130 @@
           <w:iCs/>
         </w:rPr>
         <w:t xml:space="preserve">Figure 2. The finished mosaic on its baseplate.</w:t>
+      </w:r>
+    </w:p>
+    <w:p>
+      <w:pPr>
+        <w:pStyle w:val="NormalWeb"/>
+        <w:spacing w:before="0" w:beforeAutospacing="0" w:after="60" w:afterAutospacing="0"/>
+      </w:pPr>
+      <w:r>
+        <w:t xml:space="preserve">A few controls (in the </w:t>
+      </w:r>
+      <w:r>
+        <w:rPr>
+          <w:i/>
+          <w:iCs/>
+        </w:rPr>
+        <w:t xml:space="preserve">Adjust Mosaic</w:t>
+      </w:r>
+      <w:r>
+        <w:t xml:space="preserve"> part of the panel) shape the result; change any one and the mosaic re-maps at once:</w:t>
+      </w:r>
+    </w:p>
+    <w:p>
+      <w:pPr>
+        <w:pStyle w:val="ListParagraph"/>
+        <w:numPr>
+          <w:ilvl w:val="0"/>
+          <w:numId w:val="100"/>
+        </w:numPr>
+        <w:spacing w:before="0" w:after="60"/>
+        <w:contextualSpacing w:val="0"/>
+        <w:rPr>
+          <w:rFonts w:eastAsia="Times New Roman"/>
+        </w:rPr>
+      </w:pPr>
+      <w:r>
+        <w:rPr>
+          <w:rStyle w:val="Strong"/>
+          <w:rFonts w:eastAsia="Times New Roman"/>
+        </w:rPr>
+        <w:t xml:space="preserve">Ignore background</w:t>
+      </w:r>
+      <w:r>
+        <w:t xml:space="preserve"> (on by default) — treats the removed or empty background as empty cells, so thin parts like legs survive instead of being outvoted by a sea of sky.</w:t>
+      </w:r>
+    </w:p>
+    <w:p>
+      <w:pPr>
+        <w:pStyle w:val="ListParagraph"/>
+        <w:numPr>
+          <w:ilvl w:val="0"/>
+          <w:numId w:val="100"/>
+        </w:numPr>
+        <w:spacing w:before="0" w:after="60"/>
+        <w:contextualSpacing w:val="0"/>
+        <w:rPr>
+          <w:rFonts w:eastAsia="Times New Roman"/>
+        </w:rPr>
+      </w:pPr>
+      <w:r>
+        <w:rPr>
+          <w:rStyle w:val="Strong"/>
+          <w:rFonts w:eastAsia="Times New Roman"/>
+        </w:rPr>
+        <w:t xml:space="preserve">Colors</w:t>
+      </w:r>
+      <w:r>
+        <w:t xml:space="preserve"> — how many different tile colors to reduce the picture to. A low number gives a bolder, simpler mosaic; a high number gives more shading. Sangala always snaps these to your nearest owned colors.</w:t>
+      </w:r>
+    </w:p>
+    <w:p>
+      <w:pPr>
+        <w:pStyle w:val="ListParagraph"/>
+        <w:numPr>
+          <w:ilvl w:val="0"/>
+          <w:numId w:val="100"/>
+        </w:numPr>
+        <w:spacing w:before="0" w:after="60"/>
+        <w:contextualSpacing w:val="0"/>
+        <w:rPr>
+          <w:rFonts w:eastAsia="Times New Roman"/>
+        </w:rPr>
+      </w:pPr>
+      <w:r>
+        <w:rPr>
+          <w:rStyle w:val="Strong"/>
+          <w:rFonts w:eastAsia="Times New Roman"/>
+        </w:rPr>
+        <w:t xml:space="preserve">Clean up</w:t>
+      </w:r>
+      <w:r>
+        <w:t xml:space="preserve"> — gently fills single-tile holes and drops lone stray tiles, so the mosaic reads cleanly without erasing real detail.</w:t>
+      </w:r>
+    </w:p>
+    <w:p>
+      <w:pPr>
+        <w:pStyle w:val="ListParagraph"/>
+        <w:numPr>
+          <w:ilvl w:val="0"/>
+          <w:numId w:val="100"/>
+        </w:numPr>
+        <w:spacing w:before="0" w:after="60"/>
+        <w:contextualSpacing w:val="0"/>
+        <w:rPr>
+          <w:rFonts w:eastAsia="Times New Roman"/>
+        </w:rPr>
+      </w:pPr>
+      <w:r>
+        <w:rPr>
+          <w:rStyle w:val="Strong"/>
+          <w:rFonts w:eastAsia="Times New Roman"/>
+        </w:rPr>
+        <w:t xml:space="preserve">Contrast and Brightness</w:t>
+      </w:r>
+      <w:r>
+        <w:t xml:space="preserve"> — adjust these if the picture is going muddy; a little more contrast separates the colors before they are reduced.</w:t>
+      </w:r>
+    </w:p>
+    <w:p>
+      <w:pPr>
+        <w:pStyle w:val="NormalWeb"/>
+        <w:spacing w:before="100" w:beforeAutospacing="0" w:after="100" w:afterAutospacing="0"/>
+      </w:pPr>
+      <w:r>
+        <w:t xml:space="preserve">If the result is close but not perfect, that is expected — the last touch-ups are done by hand (Section 10).</w:t>
       </w:r>
     </w:p>
     <w:p>

</xml_diff>